<commit_message>
feat(P4): 部署套件（systemd/Caddy/备份/安全检查）+ healthz + 代理真实 IP
</commit_message>
<xml_diff>
--- a/测试报告_v1.0.docx
+++ b/测试报告_v1.0.docx
@@ -24,7 +24,7 @@
           <w:color w:val="7D889B"/>
           <w:sz w:val="22"/>
         </w:rPr>
-        <w:t>15/15 通过 · 10.0 秒 · v1.0 · 2026-10-27 21:37</w:t>
+        <w:t>15/15 通过 · 9.6 秒 · v1.0 · 2026-10-27 21:42</w:t>
       </w:r>
     </w:p>
     <w:p/>
@@ -168,7 +168,7 @@
               <w:rPr>
                 <w:sz w:val="18"/>
               </w:rPr>
-              <w:t>10.0 秒（LLM 走本地缓存）</w:t>
+              <w:t>9.6 秒（LLM 走本地缓存）</w:t>
             </w:r>
           </w:p>
         </w:tc>
@@ -375,7 +375,7 @@
               <w:rPr>
                 <w:sz w:val="18"/>
               </w:rPr>
-              <w:t>633 ms</w:t>
+              <w:t>408 ms</w:t>
             </w:r>
           </w:p>
         </w:tc>
@@ -389,7 +389,7 @@
               <w:rPr>
                 <w:sz w:val="18"/>
               </w:rPr>
-              <w:t>写入 20 条 / 18.1 ms；精修 采纳 7 · 驳回 1</w:t>
+              <w:t>写入 20 条 / 19.5 ms；精修 采纳 7 · 驳回 1</w:t>
             </w:r>
           </w:p>
         </w:tc>
@@ -447,7 +447,7 @@
               <w:rPr>
                 <w:sz w:val="18"/>
               </w:rPr>
-              <w:t>413 ms</w:t>
+              <w:t>301 ms</w:t>
             </w:r>
           </w:p>
         </w:tc>
@@ -519,7 +519,7 @@
               <w:rPr>
                 <w:sz w:val="18"/>
               </w:rPr>
-              <w:t>253 ms</w:t>
+              <w:t>182 ms</w:t>
             </w:r>
           </w:p>
         </w:tc>
@@ -663,7 +663,7 @@
               <w:rPr>
                 <w:sz w:val="18"/>
               </w:rPr>
-              <w:t>284 ms</w:t>
+              <w:t>278 ms</w:t>
             </w:r>
           </w:p>
         </w:tc>
@@ -735,7 +735,7 @@
               <w:rPr>
                 <w:sz w:val="18"/>
               </w:rPr>
-              <w:t>216 ms</w:t>
+              <w:t>201 ms</w:t>
             </w:r>
           </w:p>
         </w:tc>
@@ -807,7 +807,7 @@
               <w:rPr>
                 <w:sz w:val="18"/>
               </w:rPr>
-              <w:t>272 ms</w:t>
+              <w:t>302 ms</w:t>
             </w:r>
           </w:p>
         </w:tc>
@@ -879,7 +879,7 @@
               <w:rPr>
                 <w:sz w:val="18"/>
               </w:rPr>
-              <w:t>955 ms</w:t>
+              <w:t>957 ms</w:t>
             </w:r>
           </w:p>
         </w:tc>
@@ -951,7 +951,7 @@
               <w:rPr>
                 <w:sz w:val="18"/>
               </w:rPr>
-              <w:t>122 ms</w:t>
+              <w:t>117 ms</w:t>
             </w:r>
           </w:p>
         </w:tc>
@@ -1023,7 +1023,7 @@
               <w:rPr>
                 <w:sz w:val="18"/>
               </w:rPr>
-              <w:t>116 ms</w:t>
+              <w:t>115 ms</w:t>
             </w:r>
           </w:p>
         </w:tc>
@@ -1095,7 +1095,7 @@
               <w:rPr>
                 <w:sz w:val="18"/>
               </w:rPr>
-              <w:t>118 ms</w:t>
+              <w:t>114 ms</w:t>
             </w:r>
           </w:p>
         </w:tc>
@@ -1167,7 +1167,7 @@
               <w:rPr>
                 <w:sz w:val="18"/>
               </w:rPr>
-              <w:t>118 ms</w:t>
+              <w:t>136 ms</w:t>
             </w:r>
           </w:p>
         </w:tc>
@@ -1239,7 +1239,7 @@
               <w:rPr>
                 <w:sz w:val="18"/>
               </w:rPr>
-              <w:t>2510 ms</w:t>
+              <w:t>2477 ms</w:t>
             </w:r>
           </w:p>
         </w:tc>
@@ -1311,7 +1311,7 @@
               <w:rPr>
                 <w:sz w:val="18"/>
               </w:rPr>
-              <w:t>1237 ms</w:t>
+              <w:t>1282 ms</w:t>
             </w:r>
           </w:p>
         </w:tc>
@@ -1383,7 +1383,7 @@
               <w:rPr>
                 <w:sz w:val="18"/>
               </w:rPr>
-              <w:t>2602 ms</w:t>
+              <w:t>2571 ms</w:t>
             </w:r>
           </w:p>
         </w:tc>

</xml_diff>